<commit_message>
Vary repetitive occurrences of 'developed' to improve Enhancv repetition score for Software Engineer
</commit_message>
<xml_diff>
--- a/downloads/Akhilesh_Mishra_Software_Engineer.docx
+++ b/downloads/Akhilesh_Mishra_Software_Engineer.docx
@@ -685,7 +685,7 @@
           <w:color w:val="333333"/>
           <w:sz w:val="20"/>
         </w:rPr>
-        <w:t xml:space="preserve">Created and developed a real-time workforce telemetry platform using React and FastAPI backend, serving </w:t>
+        <w:t xml:space="preserve">Engineered a real-time workforce telemetry platform using React and FastAPI backend, serving </w:t>
       </w:r>
       <w:r>
         <w:rPr>
@@ -918,7 +918,7 @@
                 <w:color w:val="333333"/>
                 <w:sz w:val="19"/>
               </w:rPr>
-              <w:t>Developed an automated student attendance tracking application integrating Python face detection algorithms (OpenCV and LBPH) with MySQL database.\n</w:t>
+              <w:t>Created an automated student attendance tracking application integrating Python face detection algorithms (OpenCV and LBPH) with MySQL database.\n</w:t>
             </w:r>
             <w:r>
               <w:rPr>

</xml_diff>

<commit_message>
Reconcile the MongoDB latency figure across variants
version1 credited a MongoDB indexing pass with 40% while version4 folded
MongoDB into the 45% figure that belongs to MySQL and PostgreSQL. Both
numbers are from the original resume and both are real, but they describe
different datastores, and the two variants sit one URL parameter apart on
a public page. version4 now names each datastore with its own figure.

Also drops the claim to having hired four engineers, in the summary as
well as the bullet. Onboarding them is the defensible half and carries the
same metric; hiring authority is a claim a three-year engineer gets pressed
on.

Co-Authored-By: Claude Opus 5 <noreply@anthropic.com>
</commit_message>
<xml_diff>
--- a/downloads/Akhilesh_Mishra_Software_Engineer.docx
+++ b/downloads/Akhilesh_Mishra_Software_Engineer.docx
@@ -75,7 +75,7 @@
           <w:color w:val="333333"/>
           <w:sz w:val="20"/>
         </w:rPr>
-        <w:t>Software engineer, 3+ years building distributed systems for national e-governance and FinTech — 2 million+ users and 500,000+ transactions a day across Spring Boot, FastAPI and Node.js services. Cut p95 latency 45% across MySQL, PostgreSQL and MongoDB, lifted message throughput 35% on Kafka, and put every service behind Prometheus and Grafana. Hired and onboarded 4 engineers and moved the team onto Docker-based CI/CD.</w:t>
+        <w:t>Software engineer, 3+ years building distributed systems for national e-governance and FinTech — 2 million+ users and 500,000+ transactions a day across Spring Boot, FastAPI and Node.js services. Cut p95 latency 45% across MySQL and PostgreSQL and 40% on MongoDB, lifted message throughput 35% on Kafka, and put every service behind Prometheus and Grafana. Onboarded 4 engineers and moved the team onto Docker-based CI/CD.</w:t>
       </w:r>
     </w:p>
     <w:p>
@@ -339,7 +339,7 @@
           <w:color w:val="333333"/>
           <w:sz w:val="20"/>
         </w:rPr>
-        <w:t xml:space="preserve">, </w:t>
+        <w:t xml:space="preserve"> and </w:t>
       </w:r>
       <w:r>
         <w:rPr>
@@ -357,6 +357,23 @@
           <w:sz w:val="20"/>
         </w:rPr>
         <w:t xml:space="preserve"> and </w:t>
+      </w:r>
+      <w:r>
+        <w:rPr>
+          <w:rFonts w:ascii="Arial" w:hAnsi="Arial"/>
+          <w:b/>
+          <w:color w:val="111111"/>
+          <w:sz w:val="20"/>
+        </w:rPr>
+        <w:t>40%</w:t>
+      </w:r>
+      <w:r>
+        <w:rPr>
+          <w:rFonts w:ascii="Arial" w:hAnsi="Arial"/>
+          <w:color w:val="333333"/>
+          <w:sz w:val="20"/>
+        </w:rPr>
+        <w:t xml:space="preserve"> on </w:t>
       </w:r>
       <w:r>
         <w:rPr>
@@ -737,7 +754,7 @@
           <w:color w:val="333333"/>
           <w:sz w:val="20"/>
         </w:rPr>
-        <w:t xml:space="preserve">, by hiring and onboarding </w:t>
+        <w:t xml:space="preserve">, by onboarding </w:t>
       </w:r>
       <w:r>
         <w:rPr>

</xml_diff>